<commit_message>
Added the ability to link initiatives, redesigned the backlog modal, adjusted the definition of the archive period, included status and weight when copying tasks, moved the shared "copy" and "move" task buttons, added checkbox logic for selecting multiple tasks at once, and updated the documentation.
</commit_message>
<xml_diff>
--- a/documentation/word/00_Паспорт_і_словник_документації.docx
+++ b/documentation/word/00_Паспорт_і_словник_документації.docx
@@ -1,6 +1,6 @@
 
 <file path=word/document.xml><?xml version="1.0" encoding="utf-8"?>
-<w:document xmlns:wpc="http://schemas.microsoft.com/office/word/2010/wordprocessingCanvas" xmlns:cx="http://schemas.microsoft.com/office/drawing/2014/chartex" xmlns:cx1="http://schemas.microsoft.com/office/drawing/2015/9/8/chartex" xmlns:cx2="http://schemas.microsoft.com/office/drawing/2015/10/21/chartex" xmlns:cx3="http://schemas.microsoft.com/office/drawing/2016/5/9/chartex" xmlns:cx4="http://schemas.microsoft.com/office/drawing/2016/5/10/chartex" xmlns:cx5="http://schemas.microsoft.com/office/drawing/2016/5/11/chartex" xmlns:cx6="http://schemas.microsoft.com/office/drawing/2016/5/12/chartex" xmlns:cx7="http://schemas.microsoft.com/office/drawing/2016/5/13/chartex" xmlns:cx8="http://schemas.microsoft.com/office/drawing/2016/5/14/chartex" xmlns:mc="http://schemas.openxmlformats.org/markup-compatibility/2006" xmlns:aink="http://schemas.microsoft.com/office/drawing/2016/ink" xmlns:am3d="http://schemas.microsoft.com/office/drawing/2017/model3d" xmlns:o="urn:schemas-microsoft-com:office:office" xmlns:oel="http://schemas.microsoft.com/office/2019/extlst" xmlns:r="http://schemas.openxmlformats.org/officeDocument/2006/relationships" xmlns:m="http://schemas.openxmlformats.org/officeDocument/2006/math" xmlns:v="urn:schemas-microsoft-com:vml" xmlns:wp14="http://schemas.microsoft.com/office/word/2010/wordprocessingDrawing" xmlns:wp="http://schemas.openxmlformats.org/drawingml/2006/wordprocessingDrawing" xmlns:w10="urn:schemas-microsoft-com:office:word" xmlns:w="http://schemas.openxmlformats.org/wordprocessingml/2006/main" xmlns:w14="http://schemas.microsoft.com/office/word/2010/wordml" xmlns:w15="http://schemas.microsoft.com/office/word/2012/wordml" xmlns:w16cei="http://schemas.microsoft.com/office/word/2026/wordml/cei" xmlns:w16cex="http://schemas.microsoft.com/office/word/2018/wordml/cex" xmlns:w16cid="http://schemas.microsoft.com/office/word/2016/wordml/cid" xmlns:w16="http://schemas.microsoft.com/office/word/2018/wordml" xmlns:w16du="http://schemas.microsoft.com/office/word/2023/wordml/word16du" xmlns:w16sdtdh="http://schemas.microsoft.com/office/word/2020/wordml/sdtdatahash" xmlns:w16sdtfl="http://schemas.microsoft.com/office/word/2024/wordml/sdtformatlock" xmlns:w16se="http://schemas.microsoft.com/office/word/2015/wordml/symex" xmlns:wpg="http://schemas.microsoft.com/office/word/2010/wordprocessingGroup" xmlns:wpi="http://schemas.microsoft.com/office/word/2010/wordprocessingInk" xmlns:wne="http://schemas.microsoft.com/office/word/2006/wordml" xmlns:wps="http://schemas.microsoft.com/office/word/2010/wordprocessingShape" mc:Ignorable="w14 w15 w16se w16cid w16 w16cex w16sdtdh w16sdtfl w16du wp14">
+<w:document xmlns:wpc="http://schemas.microsoft.com/office/word/2010/wordprocessingCanvas" xmlns:cx="http://schemas.microsoft.com/office/drawing/2014/chartex" xmlns:cx1="http://schemas.microsoft.com/office/drawing/2015/9/8/chartex" xmlns:cx2="http://schemas.microsoft.com/office/drawing/2015/10/21/chartex" xmlns:cx3="http://schemas.microsoft.com/office/drawing/2016/5/9/chartex" xmlns:cx4="http://schemas.microsoft.com/office/drawing/2016/5/10/chartex" xmlns:cx5="http://schemas.microsoft.com/office/drawing/2016/5/11/chartex" xmlns:cx6="http://schemas.microsoft.com/office/drawing/2016/5/12/chartex" xmlns:cx7="http://schemas.microsoft.com/office/drawing/2016/5/13/chartex" xmlns:cx8="http://schemas.microsoft.com/office/drawing/2016/5/14/chartex" xmlns:mc="http://schemas.openxmlformats.org/markup-compatibility/2006" xmlns:aink="http://schemas.microsoft.com/office/drawing/2016/ink" xmlns:am3d="http://schemas.microsoft.com/office/drawing/2017/model3d" xmlns:o="urn:schemas-microsoft-com:office:office" xmlns:oel="http://schemas.microsoft.com/office/2019/extlst" xmlns:r="http://schemas.openxmlformats.org/officeDocument/2006/relationships" xmlns:m="http://schemas.openxmlformats.org/officeDocument/2006/math" xmlns:v="urn:schemas-microsoft-com:vml" xmlns:wp14="http://schemas.microsoft.com/office/word/2010/wordprocessingDrawing" xmlns:wp="http://schemas.openxmlformats.org/drawingml/2006/wordprocessingDrawing" xmlns:w10="urn:schemas-microsoft-com:office:word" xmlns:w="http://schemas.openxmlformats.org/wordprocessingml/2006/main" xmlns:w14="http://schemas.microsoft.com/office/word/2010/wordml" xmlns:w15="http://schemas.microsoft.com/office/word/2012/wordml" xmlns:w16cex="http://schemas.microsoft.com/office/word/2018/wordml/cex" xmlns:w16cid="http://schemas.microsoft.com/office/word/2016/wordml/cid" xmlns:w16="http://schemas.microsoft.com/office/word/2018/wordml" xmlns:w16du="http://schemas.microsoft.com/office/word/2023/wordml/word16du" xmlns:w16sdtdh="http://schemas.microsoft.com/office/word/2020/wordml/sdtdatahash" xmlns:w16sdtfl="http://schemas.microsoft.com/office/word/2024/wordml/sdtformatlock" xmlns:w16se="http://schemas.microsoft.com/office/word/2015/wordml/symex" xmlns:wpg="http://schemas.microsoft.com/office/word/2010/wordprocessingGroup" xmlns:wpi="http://schemas.microsoft.com/office/word/2010/wordprocessingInk" xmlns:wne="http://schemas.microsoft.com/office/word/2006/wordml" xmlns:wps="http://schemas.microsoft.com/office/word/2010/wordprocessingShape" mc:Ignorable="w14 w15 w16se w16cid w16 w16cex w16sdtdh w16sdtfl w16du wp14">
   <w:body>
     <w:p>
       <w:pPr>
@@ -189,7 +189,7 @@
                 <w:rFonts w:eastAsia="Arial"/>
                 <w:sz w:val="18"/>
               </w:rPr>
-              <w:t>As built 11.09.2026; Git 7612dc1</w:t>
+              <w:t>As built 06.10.2026</w:t>
             </w:r>
           </w:p>
         </w:tc>
@@ -236,7 +236,7 @@
                 <w:rFonts w:eastAsia="Arial"/>
                 <w:sz w:val="18"/>
               </w:rPr>
-              <w:t>2.0</w:t>
+              <w:t>2.3</w:t>
             </w:r>
           </w:p>
         </w:tc>
@@ -285,7 +285,7 @@
                 <w:rFonts w:eastAsia="Arial"/>
                 <w:sz w:val="18"/>
               </w:rPr>
-              <w:t>15.09.2026</w:t>
+              <w:t>06.10.2026</w:t>
             </w:r>
           </w:p>
         </w:tc>
@@ -497,7 +497,7 @@
       <w:pPr>
         <w:pStyle w:val="1"/>
       </w:pPr>
-      <w:bookmarkStart w:id="0" w:name="_Toc240376003"/>
+      <w:bookmarkStart w:id="0" w:name="_Toc242178374"/>
       <w:r>
         <w:lastRenderedPageBreak/>
         <w:t>Зміст</w:t>
@@ -511,7 +511,13 @@
           <w:tab w:val="right" w:leader="dot" w:pos="10076"/>
         </w:tabs>
         <w:rPr>
+          <w:rFonts w:asciiTheme="minorHAnsi" w:hAnsiTheme="minorHAnsi"/>
           <w:noProof/>
+          <w:kern w:val="2"/>
+          <w:sz w:val="24"/>
+          <w:szCs w:val="24"/>
+          <w:lang w:val="uk-UA" w:eastAsia="uk-UA"/>
+          <w14:ligatures w14:val="standardContextual"/>
         </w:rPr>
       </w:pPr>
       <w:r>
@@ -523,7 +529,7 @@
       <w:r>
         <w:fldChar w:fldCharType="separate"/>
       </w:r>
-      <w:hyperlink w:anchor="_Toc240376003" w:history="1">
+      <w:hyperlink w:anchor="_Toc242178374" w:history="1">
         <w:r>
           <w:rPr>
             <w:rStyle w:val="affa"/>
@@ -550,7 +556,7 @@
             <w:noProof/>
             <w:webHidden/>
           </w:rPr>
-          <w:instrText xml:space="preserve"> PAGEREF _Toc240376003 \h </w:instrText>
+          <w:instrText xml:space="preserve"> PAGEREF _Toc242178374 \h </w:instrText>
         </w:r>
         <w:r>
           <w:rPr>
@@ -588,10 +594,16 @@
           <w:tab w:val="right" w:leader="dot" w:pos="10076"/>
         </w:tabs>
         <w:rPr>
+          <w:rFonts w:asciiTheme="minorHAnsi" w:hAnsiTheme="minorHAnsi"/>
           <w:noProof/>
+          <w:kern w:val="2"/>
+          <w:sz w:val="24"/>
+          <w:szCs w:val="24"/>
+          <w:lang w:val="uk-UA" w:eastAsia="uk-UA"/>
+          <w14:ligatures w14:val="standardContextual"/>
         </w:rPr>
       </w:pPr>
-      <w:hyperlink w:anchor="_Toc240376004" w:history="1">
+      <w:hyperlink w:anchor="_Toc242178375" w:history="1">
         <w:r>
           <w:rPr>
             <w:rStyle w:val="affa"/>
@@ -618,7 +630,7 @@
             <w:noProof/>
             <w:webHidden/>
           </w:rPr>
-          <w:instrText xml:space="preserve"> PAGEREF _Toc240376004 \h </w:instrText>
+          <w:instrText xml:space="preserve"> PAGEREF _Toc242178375 \h </w:instrText>
         </w:r>
         <w:r>
           <w:rPr>
@@ -656,10 +668,16 @@
           <w:tab w:val="right" w:leader="dot" w:pos="10076"/>
         </w:tabs>
         <w:rPr>
+          <w:rFonts w:asciiTheme="minorHAnsi" w:hAnsiTheme="minorHAnsi"/>
           <w:noProof/>
+          <w:kern w:val="2"/>
+          <w:sz w:val="24"/>
+          <w:szCs w:val="24"/>
+          <w:lang w:val="uk-UA" w:eastAsia="uk-UA"/>
+          <w14:ligatures w14:val="standardContextual"/>
         </w:rPr>
       </w:pPr>
-      <w:hyperlink w:anchor="_Toc240376005" w:history="1">
+      <w:hyperlink w:anchor="_Toc242178376" w:history="1">
         <w:r>
           <w:rPr>
             <w:rStyle w:val="affa"/>
@@ -686,7 +704,7 @@
             <w:noProof/>
             <w:webHidden/>
           </w:rPr>
-          <w:instrText xml:space="preserve"> PAGEREF _Toc240376005 \h </w:instrText>
+          <w:instrText xml:space="preserve"> PAGEREF _Toc242178376 \h </w:instrText>
         </w:r>
         <w:r>
           <w:rPr>
@@ -724,10 +742,16 @@
           <w:tab w:val="right" w:leader="dot" w:pos="10076"/>
         </w:tabs>
         <w:rPr>
+          <w:rFonts w:asciiTheme="minorHAnsi" w:hAnsiTheme="minorHAnsi"/>
           <w:noProof/>
+          <w:kern w:val="2"/>
+          <w:sz w:val="24"/>
+          <w:szCs w:val="24"/>
+          <w:lang w:val="uk-UA" w:eastAsia="uk-UA"/>
+          <w14:ligatures w14:val="standardContextual"/>
         </w:rPr>
       </w:pPr>
-      <w:hyperlink w:anchor="_Toc240376006" w:history="1">
+      <w:hyperlink w:anchor="_Toc242178377" w:history="1">
         <w:r>
           <w:rPr>
             <w:rStyle w:val="affa"/>
@@ -754,7 +778,7 @@
             <w:noProof/>
             <w:webHidden/>
           </w:rPr>
-          <w:instrText xml:space="preserve"> PAGEREF _Toc240376006 \h </w:instrText>
+          <w:instrText xml:space="preserve"> PAGEREF _Toc242178377 \h </w:instrText>
         </w:r>
         <w:r>
           <w:rPr>
@@ -792,10 +816,16 @@
           <w:tab w:val="right" w:leader="dot" w:pos="10076"/>
         </w:tabs>
         <w:rPr>
+          <w:rFonts w:asciiTheme="minorHAnsi" w:hAnsiTheme="minorHAnsi"/>
           <w:noProof/>
+          <w:kern w:val="2"/>
+          <w:sz w:val="24"/>
+          <w:szCs w:val="24"/>
+          <w:lang w:val="uk-UA" w:eastAsia="uk-UA"/>
+          <w14:ligatures w14:val="standardContextual"/>
         </w:rPr>
       </w:pPr>
-      <w:hyperlink w:anchor="_Toc240376007" w:history="1">
+      <w:hyperlink w:anchor="_Toc242178378" w:history="1">
         <w:r>
           <w:rPr>
             <w:rStyle w:val="affa"/>
@@ -822,7 +852,7 @@
             <w:noProof/>
             <w:webHidden/>
           </w:rPr>
-          <w:instrText xml:space="preserve"> PAGEREF _Toc240376007 \h </w:instrText>
+          <w:instrText xml:space="preserve"> PAGEREF _Toc242178378 \h </w:instrText>
         </w:r>
         <w:r>
           <w:rPr>
@@ -860,10 +890,16 @@
           <w:tab w:val="right" w:leader="dot" w:pos="10076"/>
         </w:tabs>
         <w:rPr>
+          <w:rFonts w:asciiTheme="minorHAnsi" w:hAnsiTheme="minorHAnsi"/>
           <w:noProof/>
+          <w:kern w:val="2"/>
+          <w:sz w:val="24"/>
+          <w:szCs w:val="24"/>
+          <w:lang w:val="uk-UA" w:eastAsia="uk-UA"/>
+          <w14:ligatures w14:val="standardContextual"/>
         </w:rPr>
       </w:pPr>
-      <w:hyperlink w:anchor="_Toc240376008" w:history="1">
+      <w:hyperlink w:anchor="_Toc242178379" w:history="1">
         <w:r>
           <w:rPr>
             <w:rStyle w:val="affa"/>
@@ -890,7 +926,7 @@
             <w:noProof/>
             <w:webHidden/>
           </w:rPr>
-          <w:instrText xml:space="preserve"> PAGEREF _Toc240376008 \h </w:instrText>
+          <w:instrText xml:space="preserve"> PAGEREF _Toc242178379 \h </w:instrText>
         </w:r>
         <w:r>
           <w:rPr>
@@ -928,10 +964,16 @@
           <w:tab w:val="right" w:leader="dot" w:pos="10076"/>
         </w:tabs>
         <w:rPr>
+          <w:rFonts w:asciiTheme="minorHAnsi" w:hAnsiTheme="minorHAnsi"/>
           <w:noProof/>
+          <w:kern w:val="2"/>
+          <w:sz w:val="24"/>
+          <w:szCs w:val="24"/>
+          <w:lang w:val="uk-UA" w:eastAsia="uk-UA"/>
+          <w14:ligatures w14:val="standardContextual"/>
         </w:rPr>
       </w:pPr>
-      <w:hyperlink w:anchor="_Toc240376009" w:history="1">
+      <w:hyperlink w:anchor="_Toc242178380" w:history="1">
         <w:r>
           <w:rPr>
             <w:rStyle w:val="affa"/>
@@ -958,7 +1000,7 @@
             <w:noProof/>
             <w:webHidden/>
           </w:rPr>
-          <w:instrText xml:space="preserve"> PAGEREF _Toc240376009 \h </w:instrText>
+          <w:instrText xml:space="preserve"> PAGEREF _Toc242178380 \h </w:instrText>
         </w:r>
         <w:r>
           <w:rPr>
@@ -996,10 +1038,16 @@
           <w:tab w:val="right" w:leader="dot" w:pos="10076"/>
         </w:tabs>
         <w:rPr>
+          <w:rFonts w:asciiTheme="minorHAnsi" w:hAnsiTheme="minorHAnsi"/>
           <w:noProof/>
+          <w:kern w:val="2"/>
+          <w:sz w:val="24"/>
+          <w:szCs w:val="24"/>
+          <w:lang w:val="uk-UA" w:eastAsia="uk-UA"/>
+          <w14:ligatures w14:val="standardContextual"/>
         </w:rPr>
       </w:pPr>
-      <w:hyperlink w:anchor="_Toc240376010" w:history="1">
+      <w:hyperlink w:anchor="_Toc242178381" w:history="1">
         <w:r>
           <w:rPr>
             <w:rStyle w:val="affa"/>
@@ -1026,7 +1074,7 @@
             <w:noProof/>
             <w:webHidden/>
           </w:rPr>
-          <w:instrText xml:space="preserve"> PAGEREF _Toc240376010 \h </w:instrText>
+          <w:instrText xml:space="preserve"> PAGEREF _Toc242178381 \h </w:instrText>
         </w:r>
         <w:r>
           <w:rPr>
@@ -1071,7 +1119,7 @@
       <w:pPr>
         <w:pStyle w:val="1"/>
       </w:pPr>
-      <w:bookmarkStart w:id="1" w:name="_Toc240376004"/>
+      <w:bookmarkStart w:id="1" w:name="_Toc242178375"/>
       <w:r>
         <w:lastRenderedPageBreak/>
         <w:t>1 Що входить до комплекту</w:t>
@@ -1325,7 +1373,7 @@
                 <w:rFonts w:eastAsia="Arial"/>
                 <w:sz w:val="17"/>
               </w:rPr>
-              <w:t>Детальні правила роботи та опис усіх 24 сутностей.</w:t>
+              <w:t>Детальні правила роботи та опис усіх 26 сутностей.</w:t>
             </w:r>
           </w:p>
         </w:tc>
@@ -1396,7 +1444,7 @@
                 <w:rFonts w:eastAsia="Arial"/>
                 <w:sz w:val="17"/>
               </w:rPr>
-              <w:t>BR, FR, NFR, SEC, OPS, 37 історій і критерії приймання.</w:t>
+              <w:t>BR, FR, NFR, SEC, OPS, 38 історій і критерії приймання.</w:t>
             </w:r>
           </w:p>
         </w:tc>
@@ -1630,7 +1678,7 @@
       <w:pPr>
         <w:pStyle w:val="1"/>
       </w:pPr>
-      <w:bookmarkStart w:id="2" w:name="_Toc240376005"/>
+      <w:bookmarkStart w:id="2" w:name="_Toc242178376"/>
       <w:r>
         <w:t>2 Системні ролі</w:t>
       </w:r>
@@ -1974,7 +2022,7 @@
       <w:pPr>
         <w:pStyle w:val="21"/>
       </w:pPr>
-      <w:bookmarkStart w:id="3" w:name="_Toc240376006"/>
+      <w:bookmarkStart w:id="3" w:name="_Toc242178377"/>
       <w:r>
         <w:t>2.1 Початкові права</w:t>
       </w:r>
@@ -2469,7 +2517,6 @@
                 <w:rFonts w:eastAsia="Arial"/>
                 <w:sz w:val="15"/>
               </w:rPr>
-              <w:lastRenderedPageBreak/>
               <w:t>SUPER_ADMIN</w:t>
             </w:r>
           </w:p>
@@ -2595,7 +2642,7 @@
       <w:pPr>
         <w:pStyle w:val="1"/>
       </w:pPr>
-      <w:bookmarkStart w:id="4" w:name="_Toc240376007"/>
+      <w:bookmarkStart w:id="4" w:name="_Toc242178378"/>
       <w:r>
         <w:t>3 Словник зрозумілих термінів</w:t>
       </w:r>
@@ -3347,7 +3394,7 @@
                 <w:rFonts w:eastAsia="Arial"/>
                 <w:sz w:val="16"/>
               </w:rPr>
-              <w:t>Створити новий пункт роботи в іншій картці зі зв’язком із першоджерелом і без успадкування завершеного стану.</w:t>
+              <w:t>Створити новий пункт роботи в іншій картці, зберігши текст, статус, вагу, виконавців і походження; новий пункт отримує власний ID.</w:t>
             </w:r>
           </w:p>
         </w:tc>
@@ -3394,15 +3441,7 @@
                 <w:rFonts w:eastAsia="Arial"/>
                 <w:sz w:val="16"/>
               </w:rPr>
-              <w:t xml:space="preserve">Картка завершеного кварталу після закінчення дозволеного строку звичайного </w:t>
-            </w:r>
-            <w:r>
-              <w:rPr>
-                <w:rFonts w:eastAsia="Arial"/>
-                <w:sz w:val="16"/>
-              </w:rPr>
-              <w:lastRenderedPageBreak/>
-              <w:t>редагування.</w:t>
+              <w:t>Картка завершеного кварталу після закінчення дозволеного строку звичайного редагування.</w:t>
             </w:r>
           </w:p>
         </w:tc>
@@ -3429,7 +3468,6 @@
                 <w:rFonts w:eastAsia="Arial"/>
                 <w:sz w:val="16"/>
               </w:rPr>
-              <w:lastRenderedPageBreak/>
               <w:t>Ревізія</w:t>
             </w:r>
           </w:p>
@@ -3553,6 +3591,55 @@
           </w:p>
         </w:tc>
       </w:tr>
+      <w:tr>
+        <w:trPr>
+          <w:jc w:val="center"/>
+        </w:trPr>
+        <w:tc>
+          <w:tcPr>
+            <w:tcW w:w="2665" w:type="dxa"/>
+            <w:shd w:val="clear" w:color="auto" w:fill="EAF2F8"/>
+            <w:tcMar>
+              <w:top w:w="90" w:type="dxa"/>
+              <w:left w:w="110" w:type="dxa"/>
+              <w:bottom w:w="90" w:type="dxa"/>
+              <w:right w:w="110" w:type="dxa"/>
+            </w:tcMar>
+            <w:vAlign w:val="center"/>
+          </w:tcPr>
+          <w:p>
+            <w:r>
+              <w:rPr>
+                <w:rFonts w:eastAsia="Arial"/>
+                <w:sz w:val="16"/>
+              </w:rPr>
+              <w:t>Пов’язана ініціатива</w:t>
+            </w:r>
+          </w:p>
+        </w:tc>
+        <w:tc>
+          <w:tcPr>
+            <w:tcW w:w="6633" w:type="dxa"/>
+            <w:shd w:val="clear" w:color="auto" w:fill="EAF2F8"/>
+            <w:tcMar>
+              <w:top w:w="90" w:type="dxa"/>
+              <w:left w:w="110" w:type="dxa"/>
+              <w:bottom w:w="90" w:type="dxa"/>
+              <w:right w:w="110" w:type="dxa"/>
+            </w:tcMar>
+            <w:vAlign w:val="center"/>
+          </w:tcPr>
+          <w:p>
+            <w:r>
+              <w:rPr>
+                <w:rFonts w:eastAsia="Arial"/>
+                <w:sz w:val="16"/>
+              </w:rPr>
+              <w:t>Незалежний проєкт або операційна задача, з якими створено двосторонній навігаційний зв’язок без об’єднання даних.</w:t>
+            </w:r>
+          </w:p>
+        </w:tc>
+      </w:tr>
     </w:tbl>
     <w:p>
       <w:pPr>
@@ -3563,7 +3650,7 @@
       <w:pPr>
         <w:pStyle w:val="1"/>
       </w:pPr>
-      <w:bookmarkStart w:id="5" w:name="_Toc240376008"/>
+      <w:bookmarkStart w:id="5" w:name="_Toc242178379"/>
       <w:r>
         <w:t>4 Джерела істини</w:t>
       </w:r>
@@ -3613,7 +3700,7 @@
       <w:pPr>
         <w:pStyle w:val="1"/>
       </w:pPr>
-      <w:bookmarkStart w:id="6" w:name="_Toc240376009"/>
+      <w:bookmarkStart w:id="6" w:name="_Toc242178380"/>
       <w:r>
         <w:t>5 Трасування</w:t>
       </w:r>
@@ -4171,7 +4258,7 @@
       <w:pPr>
         <w:pStyle w:val="1"/>
       </w:pPr>
-      <w:bookmarkStart w:id="7" w:name="_Toc240376010"/>
+      <w:bookmarkStart w:id="7" w:name="_Toc242178381"/>
       <w:r>
         <w:t>6 Правила підтримки</w:t>
       </w:r>
@@ -4218,8 +4305,12 @@
       </w:r>
     </w:p>
     <w:sectPr>
-      <w:headerReference w:type="default" r:id="rId8"/>
-      <w:footerReference w:type="default" r:id="rId9"/>
+      <w:headerReference w:type="even" r:id="rId8"/>
+      <w:headerReference w:type="default" r:id="rId9"/>
+      <w:footerReference w:type="even" r:id="rId10"/>
+      <w:footerReference w:type="default" r:id="rId11"/>
+      <w:headerReference w:type="first" r:id="rId12"/>
+      <w:footerReference w:type="first" r:id="rId13"/>
       <w:pgSz w:w="12240" w:h="15840"/>
       <w:pgMar w:top="1020" w:right="1020" w:bottom="964" w:left="1134" w:header="454" w:footer="454" w:gutter="0"/>
       <w:cols w:space="720"/>
@@ -4230,7 +4321,7 @@
 </file>
 
 <file path=word/endnotes.xml><?xml version="1.0" encoding="utf-8"?>
-<w:endnotes xmlns:wpc="http://schemas.microsoft.com/office/word/2010/wordprocessingCanvas" xmlns:cx="http://schemas.microsoft.com/office/drawing/2014/chartex" xmlns:cx1="http://schemas.microsoft.com/office/drawing/2015/9/8/chartex" xmlns:cx2="http://schemas.microsoft.com/office/drawing/2015/10/21/chartex" xmlns:cx3="http://schemas.microsoft.com/office/drawing/2016/5/9/chartex" xmlns:cx4="http://schemas.microsoft.com/office/drawing/2016/5/10/chartex" xmlns:cx5="http://schemas.microsoft.com/office/drawing/2016/5/11/chartex" xmlns:cx6="http://schemas.microsoft.com/office/drawing/2016/5/12/chartex" xmlns:cx7="http://schemas.microsoft.com/office/drawing/2016/5/13/chartex" xmlns:cx8="http://schemas.microsoft.com/office/drawing/2016/5/14/chartex" xmlns:mc="http://schemas.openxmlformats.org/markup-compatibility/2006" xmlns:aink="http://schemas.microsoft.com/office/drawing/2016/ink" xmlns:am3d="http://schemas.microsoft.com/office/drawing/2017/model3d" xmlns:o="urn:schemas-microsoft-com:office:office" xmlns:oel="http://schemas.microsoft.com/office/2019/extlst" xmlns:r="http://schemas.openxmlformats.org/officeDocument/2006/relationships" xmlns:m="http://schemas.openxmlformats.org/officeDocument/2006/math" xmlns:v="urn:schemas-microsoft-com:vml" xmlns:wp14="http://schemas.microsoft.com/office/word/2010/wordprocessingDrawing" xmlns:wp="http://schemas.openxmlformats.org/drawingml/2006/wordprocessingDrawing" xmlns:w10="urn:schemas-microsoft-com:office:word" xmlns:w="http://schemas.openxmlformats.org/wordprocessingml/2006/main" xmlns:w14="http://schemas.microsoft.com/office/word/2010/wordml" xmlns:w15="http://schemas.microsoft.com/office/word/2012/wordml" xmlns:w16cei="http://schemas.microsoft.com/office/word/2026/wordml/cei" xmlns:w16cex="http://schemas.microsoft.com/office/word/2018/wordml/cex" xmlns:w16cid="http://schemas.microsoft.com/office/word/2016/wordml/cid" xmlns:w16="http://schemas.microsoft.com/office/word/2018/wordml" xmlns:w16du="http://schemas.microsoft.com/office/word/2023/wordml/word16du" xmlns:w16sdtdh="http://schemas.microsoft.com/office/word/2020/wordml/sdtdatahash" xmlns:w16sdtfl="http://schemas.microsoft.com/office/word/2024/wordml/sdtformatlock" xmlns:w16se="http://schemas.microsoft.com/office/word/2015/wordml/symex" xmlns:wpg="http://schemas.microsoft.com/office/word/2010/wordprocessingGroup" xmlns:wpi="http://schemas.microsoft.com/office/word/2010/wordprocessingInk" xmlns:wne="http://schemas.microsoft.com/office/word/2006/wordml" xmlns:wps="http://schemas.microsoft.com/office/word/2010/wordprocessingShape" mc:Ignorable="w14 w15 w16se w16cid w16 w16cex w16sdtdh w16sdtfl w16du wp14">
+<w:endnotes xmlns:wpc="http://schemas.microsoft.com/office/word/2010/wordprocessingCanvas" xmlns:cx="http://schemas.microsoft.com/office/drawing/2014/chartex" xmlns:cx1="http://schemas.microsoft.com/office/drawing/2015/9/8/chartex" xmlns:cx2="http://schemas.microsoft.com/office/drawing/2015/10/21/chartex" xmlns:cx3="http://schemas.microsoft.com/office/drawing/2016/5/9/chartex" xmlns:cx4="http://schemas.microsoft.com/office/drawing/2016/5/10/chartex" xmlns:cx5="http://schemas.microsoft.com/office/drawing/2016/5/11/chartex" xmlns:cx6="http://schemas.microsoft.com/office/drawing/2016/5/12/chartex" xmlns:cx7="http://schemas.microsoft.com/office/drawing/2016/5/13/chartex" xmlns:cx8="http://schemas.microsoft.com/office/drawing/2016/5/14/chartex" xmlns:mc="http://schemas.openxmlformats.org/markup-compatibility/2006" xmlns:aink="http://schemas.microsoft.com/office/drawing/2016/ink" xmlns:am3d="http://schemas.microsoft.com/office/drawing/2017/model3d" xmlns:o="urn:schemas-microsoft-com:office:office" xmlns:oel="http://schemas.microsoft.com/office/2019/extlst" xmlns:r="http://schemas.openxmlformats.org/officeDocument/2006/relationships" xmlns:m="http://schemas.openxmlformats.org/officeDocument/2006/math" xmlns:v="urn:schemas-microsoft-com:vml" xmlns:wp14="http://schemas.microsoft.com/office/word/2010/wordprocessingDrawing" xmlns:wp="http://schemas.openxmlformats.org/drawingml/2006/wordprocessingDrawing" xmlns:w10="urn:schemas-microsoft-com:office:word" xmlns:w="http://schemas.openxmlformats.org/wordprocessingml/2006/main" xmlns:w14="http://schemas.microsoft.com/office/word/2010/wordml" xmlns:w15="http://schemas.microsoft.com/office/word/2012/wordml" xmlns:w16cex="http://schemas.microsoft.com/office/word/2018/wordml/cex" xmlns:w16cid="http://schemas.microsoft.com/office/word/2016/wordml/cid" xmlns:w16="http://schemas.microsoft.com/office/word/2018/wordml" xmlns:w16du="http://schemas.microsoft.com/office/word/2023/wordml/word16du" xmlns:w16sdtdh="http://schemas.microsoft.com/office/word/2020/wordml/sdtdatahash" xmlns:w16sdtfl="http://schemas.microsoft.com/office/word/2024/wordml/sdtformatlock" xmlns:w16se="http://schemas.microsoft.com/office/word/2015/wordml/symex" xmlns:wpg="http://schemas.microsoft.com/office/word/2010/wordprocessingGroup" xmlns:wpi="http://schemas.microsoft.com/office/word/2010/wordprocessingInk" xmlns:wne="http://schemas.microsoft.com/office/word/2006/wordml" xmlns:wps="http://schemas.microsoft.com/office/word/2010/wordprocessingShape" mc:Ignorable="w14 w15 w16se w16cid w16 w16cex w16sdtdh w16sdtfl w16du wp14">
   <w:endnote w:type="separator" w:id="-1">
     <w:p>
       <w:pPr>
@@ -4255,130 +4346,56 @@
 </file>
 
 <file path=word/footer1.xml><?xml version="1.0" encoding="utf-8"?>
-<w:ftr xmlns:wpc="http://schemas.microsoft.com/office/word/2010/wordprocessingCanvas" xmlns:cx="http://schemas.microsoft.com/office/drawing/2014/chartex" xmlns:cx1="http://schemas.microsoft.com/office/drawing/2015/9/8/chartex" xmlns:cx2="http://schemas.microsoft.com/office/drawing/2015/10/21/chartex" xmlns:cx3="http://schemas.microsoft.com/office/drawing/2016/5/9/chartex" xmlns:cx4="http://schemas.microsoft.com/office/drawing/2016/5/10/chartex" xmlns:cx5="http://schemas.microsoft.com/office/drawing/2016/5/11/chartex" xmlns:cx6="http://schemas.microsoft.com/office/drawing/2016/5/12/chartex" xmlns:cx7="http://schemas.microsoft.com/office/drawing/2016/5/13/chartex" xmlns:cx8="http://schemas.microsoft.com/office/drawing/2016/5/14/chartex" xmlns:mc="http://schemas.openxmlformats.org/markup-compatibility/2006" xmlns:aink="http://schemas.microsoft.com/office/drawing/2016/ink" xmlns:am3d="http://schemas.microsoft.com/office/drawing/2017/model3d" xmlns:o="urn:schemas-microsoft-com:office:office" xmlns:oel="http://schemas.microsoft.com/office/2019/extlst" xmlns:r="http://schemas.openxmlformats.org/officeDocument/2006/relationships" xmlns:m="http://schemas.openxmlformats.org/officeDocument/2006/math" xmlns:v="urn:schemas-microsoft-com:vml" xmlns:wp14="http://schemas.microsoft.com/office/word/2010/wordprocessingDrawing" xmlns:wp="http://schemas.openxmlformats.org/drawingml/2006/wordprocessingDrawing" xmlns:w10="urn:schemas-microsoft-com:office:word" xmlns:w="http://schemas.openxmlformats.org/wordprocessingml/2006/main" xmlns:w14="http://schemas.microsoft.com/office/word/2010/wordml" xmlns:w15="http://schemas.microsoft.com/office/word/2012/wordml" xmlns:w16cei="http://schemas.microsoft.com/office/word/2026/wordml/cei" xmlns:w16cex="http://schemas.microsoft.com/office/word/2018/wordml/cex" xmlns:w16cid="http://schemas.microsoft.com/office/word/2016/wordml/cid" xmlns:w16="http://schemas.microsoft.com/office/word/2018/wordml" xmlns:w16du="http://schemas.microsoft.com/office/word/2023/wordml/word16du" xmlns:w16sdtdh="http://schemas.microsoft.com/office/word/2020/wordml/sdtdatahash" xmlns:w16sdtfl="http://schemas.microsoft.com/office/word/2024/wordml/sdtformatlock" xmlns:w16se="http://schemas.microsoft.com/office/word/2015/wordml/symex" xmlns:wpg="http://schemas.microsoft.com/office/word/2010/wordprocessingGroup" xmlns:wpi="http://schemas.microsoft.com/office/word/2010/wordprocessingInk" xmlns:wne="http://schemas.microsoft.com/office/word/2006/wordml" xmlns:wps="http://schemas.microsoft.com/office/word/2010/wordprocessingShape" mc:Ignorable="w14 w15 w16se w16cid w16 w16cex w16sdtdh w16sdtfl w16du wp14">
+<w:ftr xmlns:wpc="http://schemas.microsoft.com/office/word/2010/wordprocessingCanvas" xmlns:cx="http://schemas.microsoft.com/office/drawing/2014/chartex" xmlns:cx1="http://schemas.microsoft.com/office/drawing/2015/9/8/chartex" xmlns:cx2="http://schemas.microsoft.com/office/drawing/2015/10/21/chartex" xmlns:cx3="http://schemas.microsoft.com/office/drawing/2016/5/9/chartex" xmlns:cx4="http://schemas.microsoft.com/office/drawing/2016/5/10/chartex" xmlns:cx5="http://schemas.microsoft.com/office/drawing/2016/5/11/chartex" xmlns:cx6="http://schemas.microsoft.com/office/drawing/2016/5/12/chartex" xmlns:cx7="http://schemas.microsoft.com/office/drawing/2016/5/13/chartex" xmlns:cx8="http://schemas.microsoft.com/office/drawing/2016/5/14/chartex" xmlns:mc="http://schemas.openxmlformats.org/markup-compatibility/2006" xmlns:aink="http://schemas.microsoft.com/office/drawing/2016/ink" xmlns:am3d="http://schemas.microsoft.com/office/drawing/2017/model3d" xmlns:o="urn:schemas-microsoft-com:office:office" xmlns:oel="http://schemas.microsoft.com/office/2019/extlst" xmlns:r="http://schemas.openxmlformats.org/officeDocument/2006/relationships" xmlns:m="http://schemas.openxmlformats.org/officeDocument/2006/math" xmlns:v="urn:schemas-microsoft-com:vml" xmlns:wp14="http://schemas.microsoft.com/office/word/2010/wordprocessingDrawing" xmlns:wp="http://schemas.openxmlformats.org/drawingml/2006/wordprocessingDrawing" xmlns:w10="urn:schemas-microsoft-com:office:word" xmlns:w="http://schemas.openxmlformats.org/wordprocessingml/2006/main" xmlns:w14="http://schemas.microsoft.com/office/word/2010/wordml" xmlns:w15="http://schemas.microsoft.com/office/word/2012/wordml" xmlns:w16cex="http://schemas.microsoft.com/office/word/2018/wordml/cex" xmlns:w16cid="http://schemas.microsoft.com/office/word/2016/wordml/cid" xmlns:w16="http://schemas.microsoft.com/office/word/2018/wordml" xmlns:w16du="http://schemas.microsoft.com/office/word/2023/wordml/word16du" xmlns:w16sdtdh="http://schemas.microsoft.com/office/word/2020/wordml/sdtdatahash" xmlns:w16sdtfl="http://schemas.microsoft.com/office/word/2024/wordml/sdtformatlock" xmlns:w16se="http://schemas.microsoft.com/office/word/2015/wordml/symex" xmlns:wpg="http://schemas.microsoft.com/office/word/2010/wordprocessingGroup" xmlns:wpi="http://schemas.microsoft.com/office/word/2010/wordprocessingInk" xmlns:wne="http://schemas.microsoft.com/office/word/2006/wordml" xmlns:wps="http://schemas.microsoft.com/office/word/2010/wordprocessingShape" mc:Ignorable="w14 w15 w16se w16cid w16 w16cex w16sdtdh w16sdtfl w16du wp14">
+  <w:p>
+    <w:pPr>
+      <w:pStyle w:val="a7"/>
+    </w:pPr>
+  </w:p>
+</w:ftr>
+</file>
+
+<file path=word/footer2.xml><?xml version="1.0" encoding="utf-8"?>
+<w:ftr xmlns:wpc="http://schemas.microsoft.com/office/word/2010/wordprocessingCanvas" xmlns:cx="http://schemas.microsoft.com/office/drawing/2014/chartex" xmlns:cx1="http://schemas.microsoft.com/office/drawing/2015/9/8/chartex" xmlns:cx2="http://schemas.microsoft.com/office/drawing/2015/10/21/chartex" xmlns:cx3="http://schemas.microsoft.com/office/drawing/2016/5/9/chartex" xmlns:cx4="http://schemas.microsoft.com/office/drawing/2016/5/10/chartex" xmlns:cx5="http://schemas.microsoft.com/office/drawing/2016/5/11/chartex" xmlns:cx6="http://schemas.microsoft.com/office/drawing/2016/5/12/chartex" xmlns:cx7="http://schemas.microsoft.com/office/drawing/2016/5/13/chartex" xmlns:cx8="http://schemas.microsoft.com/office/drawing/2016/5/14/chartex" xmlns:mc="http://schemas.openxmlformats.org/markup-compatibility/2006" xmlns:aink="http://schemas.microsoft.com/office/drawing/2016/ink" xmlns:am3d="http://schemas.microsoft.com/office/drawing/2017/model3d" xmlns:o="urn:schemas-microsoft-com:office:office" xmlns:oel="http://schemas.microsoft.com/office/2019/extlst" xmlns:r="http://schemas.openxmlformats.org/officeDocument/2006/relationships" xmlns:m="http://schemas.openxmlformats.org/officeDocument/2006/math" xmlns:v="urn:schemas-microsoft-com:vml" xmlns:wp14="http://schemas.microsoft.com/office/word/2010/wordprocessingDrawing" xmlns:wp="http://schemas.openxmlformats.org/drawingml/2006/wordprocessingDrawing" xmlns:w10="urn:schemas-microsoft-com:office:word" xmlns:w="http://schemas.openxmlformats.org/wordprocessingml/2006/main" xmlns:w14="http://schemas.microsoft.com/office/word/2010/wordml" xmlns:w15="http://schemas.microsoft.com/office/word/2012/wordml" xmlns:w16cex="http://schemas.microsoft.com/office/word/2018/wordml/cex" xmlns:w16cid="http://schemas.microsoft.com/office/word/2016/wordml/cid" xmlns:w16="http://schemas.microsoft.com/office/word/2018/wordml" xmlns:w16du="http://schemas.microsoft.com/office/word/2023/wordml/word16du" xmlns:w16sdtdh="http://schemas.microsoft.com/office/word/2020/wordml/sdtdatahash" xmlns:w16sdtfl="http://schemas.microsoft.com/office/word/2024/wordml/sdtformatlock" xmlns:w16se="http://schemas.microsoft.com/office/word/2015/wordml/symex" xmlns:wpg="http://schemas.microsoft.com/office/word/2010/wordprocessingGroup" xmlns:wpi="http://schemas.microsoft.com/office/word/2010/wordprocessingInk" xmlns:wne="http://schemas.microsoft.com/office/word/2006/wordml" xmlns:wps="http://schemas.microsoft.com/office/word/2010/wordprocessingShape" mc:Ignorable="w14 w15 w16se w16cid w16 w16cex w16sdtdh w16sdtfl w16du wp14">
   <w:p>
     <w:pPr>
       <w:pStyle w:val="a7"/>
       <w:jc w:val="center"/>
     </w:pPr>
-    <w:proofErr w:type="spellStart"/>
     <w:r>
-      <w:rPr>
-        <w:rFonts w:eastAsia="Arial"/>
-        <w:color w:val="666666"/>
-        <w:sz w:val="16"/>
-      </w:rPr>
-      <w:t>Версія</w:t>
-    </w:r>
-    <w:proofErr w:type="spellEnd"/>
-    <w:r>
-      <w:rPr>
-        <w:rFonts w:eastAsia="Arial"/>
-        <w:color w:val="666666"/>
-        <w:sz w:val="16"/>
-      </w:rPr>
-      <w:t xml:space="preserve"> </w:t>
-    </w:r>
-    <w:proofErr w:type="gramStart"/>
-    <w:r>
-      <w:rPr>
-        <w:rFonts w:eastAsia="Arial"/>
-        <w:color w:val="666666"/>
-        <w:sz w:val="16"/>
-      </w:rPr>
-      <w:t>2.0  |</w:t>
-    </w:r>
-    <w:proofErr w:type="gramEnd"/>
-    <w:r>
-      <w:rPr>
-        <w:rFonts w:eastAsia="Arial"/>
-        <w:color w:val="666666"/>
-        <w:sz w:val="16"/>
-      </w:rPr>
-      <w:t xml:space="preserve">  7612dc</w:t>
-    </w:r>
-    <w:proofErr w:type="gramStart"/>
-    <w:r>
-      <w:rPr>
-        <w:rFonts w:eastAsia="Arial"/>
-        <w:color w:val="666666"/>
-        <w:sz w:val="16"/>
-      </w:rPr>
-      <w:t>1  |</w:t>
-    </w:r>
-    <w:proofErr w:type="gramEnd"/>
-    <w:r>
-      <w:rPr>
-        <w:rFonts w:eastAsia="Arial"/>
-        <w:color w:val="666666"/>
-        <w:sz w:val="16"/>
-      </w:rPr>
-      <w:t xml:space="preserve">  </w:t>
-    </w:r>
-    <w:proofErr w:type="spellStart"/>
-    <w:r>
-      <w:rPr>
-        <w:rFonts w:eastAsia="Arial"/>
-        <w:color w:val="666666"/>
-        <w:sz w:val="16"/>
-      </w:rPr>
-      <w:t>стор</w:t>
-    </w:r>
-    <w:proofErr w:type="spellEnd"/>
-    <w:r>
-      <w:rPr>
-        <w:rFonts w:eastAsia="Arial"/>
-        <w:color w:val="666666"/>
-        <w:sz w:val="16"/>
-      </w:rPr>
-      <w:t xml:space="preserve">. </w:t>
+      <w:t xml:space="preserve">Версія 2.3  |  7612dc1  |  стор. </w:t>
     </w:r>
     <w:r>
-      <w:rPr>
-        <w:rFonts w:eastAsia="Arial"/>
-        <w:color w:val="666666"/>
-        <w:sz w:val="16"/>
-      </w:rPr>
       <w:fldChar w:fldCharType="begin"/>
     </w:r>
     <w:r>
-      <w:rPr>
-        <w:rFonts w:eastAsia="Arial"/>
-        <w:color w:val="666666"/>
-        <w:sz w:val="16"/>
-      </w:rPr>
       <w:instrText xml:space="preserve"> PAGE </w:instrText>
     </w:r>
     <w:r>
-      <w:rPr>
-        <w:rFonts w:eastAsia="Arial"/>
-        <w:color w:val="666666"/>
-        <w:sz w:val="16"/>
-      </w:rPr>
       <w:fldChar w:fldCharType="separate"/>
     </w:r>
     <w:r>
-      <w:rPr>
-        <w:rFonts w:eastAsia="Arial"/>
-        <w:color w:val="666666"/>
-        <w:sz w:val="16"/>
-      </w:rPr>
       <w:t>1</w:t>
     </w:r>
     <w:r>
-      <w:rPr>
-        <w:rFonts w:eastAsia="Arial"/>
-        <w:color w:val="666666"/>
-        <w:sz w:val="16"/>
-      </w:rPr>
       <w:fldChar w:fldCharType="end"/>
     </w:r>
   </w:p>
 </w:ftr>
 </file>
 
+<file path=word/footer3.xml><?xml version="1.0" encoding="utf-8"?>
+<w:ftr xmlns:wpc="http://schemas.microsoft.com/office/word/2010/wordprocessingCanvas" xmlns:cx="http://schemas.microsoft.com/office/drawing/2014/chartex" xmlns:cx1="http://schemas.microsoft.com/office/drawing/2015/9/8/chartex" xmlns:cx2="http://schemas.microsoft.com/office/drawing/2015/10/21/chartex" xmlns:cx3="http://schemas.microsoft.com/office/drawing/2016/5/9/chartex" xmlns:cx4="http://schemas.microsoft.com/office/drawing/2016/5/10/chartex" xmlns:cx5="http://schemas.microsoft.com/office/drawing/2016/5/11/chartex" xmlns:cx6="http://schemas.microsoft.com/office/drawing/2016/5/12/chartex" xmlns:cx7="http://schemas.microsoft.com/office/drawing/2016/5/13/chartex" xmlns:cx8="http://schemas.microsoft.com/office/drawing/2016/5/14/chartex" xmlns:mc="http://schemas.openxmlformats.org/markup-compatibility/2006" xmlns:aink="http://schemas.microsoft.com/office/drawing/2016/ink" xmlns:am3d="http://schemas.microsoft.com/office/drawing/2017/model3d" xmlns:o="urn:schemas-microsoft-com:office:office" xmlns:oel="http://schemas.microsoft.com/office/2019/extlst" xmlns:r="http://schemas.openxmlformats.org/officeDocument/2006/relationships" xmlns:m="http://schemas.openxmlformats.org/officeDocument/2006/math" xmlns:v="urn:schemas-microsoft-com:vml" xmlns:wp14="http://schemas.microsoft.com/office/word/2010/wordprocessingDrawing" xmlns:wp="http://schemas.openxmlformats.org/drawingml/2006/wordprocessingDrawing" xmlns:w10="urn:schemas-microsoft-com:office:word" xmlns:w="http://schemas.openxmlformats.org/wordprocessingml/2006/main" xmlns:w14="http://schemas.microsoft.com/office/word/2010/wordml" xmlns:w15="http://schemas.microsoft.com/office/word/2012/wordml" xmlns:w16cex="http://schemas.microsoft.com/office/word/2018/wordml/cex" xmlns:w16cid="http://schemas.microsoft.com/office/word/2016/wordml/cid" xmlns:w16="http://schemas.microsoft.com/office/word/2018/wordml" xmlns:w16du="http://schemas.microsoft.com/office/word/2023/wordml/word16du" xmlns:w16sdtdh="http://schemas.microsoft.com/office/word/2020/wordml/sdtdatahash" xmlns:w16sdtfl="http://schemas.microsoft.com/office/word/2024/wordml/sdtformatlock" xmlns:w16se="http://schemas.microsoft.com/office/word/2015/wordml/symex" xmlns:wpg="http://schemas.microsoft.com/office/word/2010/wordprocessingGroup" xmlns:wpi="http://schemas.microsoft.com/office/word/2010/wordprocessingInk" xmlns:wne="http://schemas.microsoft.com/office/word/2006/wordml" xmlns:wps="http://schemas.microsoft.com/office/word/2010/wordprocessingShape" mc:Ignorable="w14 w15 w16se w16cid w16 w16cex w16sdtdh w16sdtfl w16du wp14">
+  <w:p>
+    <w:pPr>
+      <w:pStyle w:val="a7"/>
+    </w:pPr>
+  </w:p>
+</w:ftr>
+</file>
+
 <file path=word/footnotes.xml><?xml version="1.0" encoding="utf-8"?>
-<w:footnotes xmlns:wpc="http://schemas.microsoft.com/office/word/2010/wordprocessingCanvas" xmlns:cx="http://schemas.microsoft.com/office/drawing/2014/chartex" xmlns:cx1="http://schemas.microsoft.com/office/drawing/2015/9/8/chartex" xmlns:cx2="http://schemas.microsoft.com/office/drawing/2015/10/21/chartex" xmlns:cx3="http://schemas.microsoft.com/office/drawing/2016/5/9/chartex" xmlns:cx4="http://schemas.microsoft.com/office/drawing/2016/5/10/chartex" xmlns:cx5="http://schemas.microsoft.com/office/drawing/2016/5/11/chartex" xmlns:cx6="http://schemas.microsoft.com/office/drawing/2016/5/12/chartex" xmlns:cx7="http://schemas.microsoft.com/office/drawing/2016/5/13/chartex" xmlns:cx8="http://schemas.microsoft.com/office/drawing/2016/5/14/chartex" xmlns:mc="http://schemas.openxmlformats.org/markup-compatibility/2006" xmlns:aink="http://schemas.microsoft.com/office/drawing/2016/ink" xmlns:am3d="http://schemas.microsoft.com/office/drawing/2017/model3d" xmlns:o="urn:schemas-microsoft-com:office:office" xmlns:oel="http://schemas.microsoft.com/office/2019/extlst" xmlns:r="http://schemas.openxmlformats.org/officeDocument/2006/relationships" xmlns:m="http://schemas.openxmlformats.org/officeDocument/2006/math" xmlns:v="urn:schemas-microsoft-com:vml" xmlns:wp14="http://schemas.microsoft.com/office/word/2010/wordprocessingDrawing" xmlns:wp="http://schemas.openxmlformats.org/drawingml/2006/wordprocessingDrawing" xmlns:w10="urn:schemas-microsoft-com:office:word" xmlns:w="http://schemas.openxmlformats.org/wordprocessingml/2006/main" xmlns:w14="http://schemas.microsoft.com/office/word/2010/wordml" xmlns:w15="http://schemas.microsoft.com/office/word/2012/wordml" xmlns:w16cei="http://schemas.microsoft.com/office/word/2026/wordml/cei" xmlns:w16cex="http://schemas.microsoft.com/office/word/2018/wordml/cex" xmlns:w16cid="http://schemas.microsoft.com/office/word/2016/wordml/cid" xmlns:w16="http://schemas.microsoft.com/office/word/2018/wordml" xmlns:w16du="http://schemas.microsoft.com/office/word/2023/wordml/word16du" xmlns:w16sdtdh="http://schemas.microsoft.com/office/word/2020/wordml/sdtdatahash" xmlns:w16sdtfl="http://schemas.microsoft.com/office/word/2024/wordml/sdtformatlock" xmlns:w16se="http://schemas.microsoft.com/office/word/2015/wordml/symex" xmlns:wpg="http://schemas.microsoft.com/office/word/2010/wordprocessingGroup" xmlns:wpi="http://schemas.microsoft.com/office/word/2010/wordprocessingInk" xmlns:wne="http://schemas.microsoft.com/office/word/2006/wordml" xmlns:wps="http://schemas.microsoft.com/office/word/2010/wordprocessingShape" mc:Ignorable="w14 w15 w16se w16cid w16 w16cex w16sdtdh w16sdtfl w16du wp14">
+<w:footnotes xmlns:wpc="http://schemas.microsoft.com/office/word/2010/wordprocessingCanvas" xmlns:cx="http://schemas.microsoft.com/office/drawing/2014/chartex" xmlns:cx1="http://schemas.microsoft.com/office/drawing/2015/9/8/chartex" xmlns:cx2="http://schemas.microsoft.com/office/drawing/2015/10/21/chartex" xmlns:cx3="http://schemas.microsoft.com/office/drawing/2016/5/9/chartex" xmlns:cx4="http://schemas.microsoft.com/office/drawing/2016/5/10/chartex" xmlns:cx5="http://schemas.microsoft.com/office/drawing/2016/5/11/chartex" xmlns:cx6="http://schemas.microsoft.com/office/drawing/2016/5/12/chartex" xmlns:cx7="http://schemas.microsoft.com/office/drawing/2016/5/13/chartex" xmlns:cx8="http://schemas.microsoft.com/office/drawing/2016/5/14/chartex" xmlns:mc="http://schemas.openxmlformats.org/markup-compatibility/2006" xmlns:aink="http://schemas.microsoft.com/office/drawing/2016/ink" xmlns:am3d="http://schemas.microsoft.com/office/drawing/2017/model3d" xmlns:o="urn:schemas-microsoft-com:office:office" xmlns:oel="http://schemas.microsoft.com/office/2019/extlst" xmlns:r="http://schemas.openxmlformats.org/officeDocument/2006/relationships" xmlns:m="http://schemas.openxmlformats.org/officeDocument/2006/math" xmlns:v="urn:schemas-microsoft-com:vml" xmlns:wp14="http://schemas.microsoft.com/office/word/2010/wordprocessingDrawing" xmlns:wp="http://schemas.openxmlformats.org/drawingml/2006/wordprocessingDrawing" xmlns:w10="urn:schemas-microsoft-com:office:word" xmlns:w="http://schemas.openxmlformats.org/wordprocessingml/2006/main" xmlns:w14="http://schemas.microsoft.com/office/word/2010/wordml" xmlns:w15="http://schemas.microsoft.com/office/word/2012/wordml" xmlns:w16cex="http://schemas.microsoft.com/office/word/2018/wordml/cex" xmlns:w16cid="http://schemas.microsoft.com/office/word/2016/wordml/cid" xmlns:w16="http://schemas.microsoft.com/office/word/2018/wordml" xmlns:w16du="http://schemas.microsoft.com/office/word/2023/wordml/word16du" xmlns:w16sdtdh="http://schemas.microsoft.com/office/word/2020/wordml/sdtdatahash" xmlns:w16sdtfl="http://schemas.microsoft.com/office/word/2024/wordml/sdtformatlock" xmlns:w16se="http://schemas.microsoft.com/office/word/2015/wordml/symex" xmlns:wpg="http://schemas.microsoft.com/office/word/2010/wordprocessingGroup" xmlns:wpi="http://schemas.microsoft.com/office/word/2010/wordprocessingInk" xmlns:wne="http://schemas.microsoft.com/office/word/2006/wordml" xmlns:wps="http://schemas.microsoft.com/office/word/2010/wordprocessingShape" mc:Ignorable="w14 w15 w16se w16cid w16 w16cex w16sdtdh w16sdtfl w16du wp14">
   <w:footnote w:type="separator" w:id="-1">
     <w:p>
       <w:pPr>
@@ -4403,7 +4420,17 @@
 </file>
 
 <file path=word/header1.xml><?xml version="1.0" encoding="utf-8"?>
-<w:hdr xmlns:wpc="http://schemas.microsoft.com/office/word/2010/wordprocessingCanvas" xmlns:cx="http://schemas.microsoft.com/office/drawing/2014/chartex" xmlns:cx1="http://schemas.microsoft.com/office/drawing/2015/9/8/chartex" xmlns:cx2="http://schemas.microsoft.com/office/drawing/2015/10/21/chartex" xmlns:cx3="http://schemas.microsoft.com/office/drawing/2016/5/9/chartex" xmlns:cx4="http://schemas.microsoft.com/office/drawing/2016/5/10/chartex" xmlns:cx5="http://schemas.microsoft.com/office/drawing/2016/5/11/chartex" xmlns:cx6="http://schemas.microsoft.com/office/drawing/2016/5/12/chartex" xmlns:cx7="http://schemas.microsoft.com/office/drawing/2016/5/13/chartex" xmlns:cx8="http://schemas.microsoft.com/office/drawing/2016/5/14/chartex" xmlns:mc="http://schemas.openxmlformats.org/markup-compatibility/2006" xmlns:aink="http://schemas.microsoft.com/office/drawing/2016/ink" xmlns:am3d="http://schemas.microsoft.com/office/drawing/2017/model3d" xmlns:o="urn:schemas-microsoft-com:office:office" xmlns:oel="http://schemas.microsoft.com/office/2019/extlst" xmlns:r="http://schemas.openxmlformats.org/officeDocument/2006/relationships" xmlns:m="http://schemas.openxmlformats.org/officeDocument/2006/math" xmlns:v="urn:schemas-microsoft-com:vml" xmlns:wp14="http://schemas.microsoft.com/office/word/2010/wordprocessingDrawing" xmlns:wp="http://schemas.openxmlformats.org/drawingml/2006/wordprocessingDrawing" xmlns:w10="urn:schemas-microsoft-com:office:word" xmlns:w="http://schemas.openxmlformats.org/wordprocessingml/2006/main" xmlns:w14="http://schemas.microsoft.com/office/word/2010/wordml" xmlns:w15="http://schemas.microsoft.com/office/word/2012/wordml" xmlns:w16cei="http://schemas.microsoft.com/office/word/2026/wordml/cei" xmlns:w16cex="http://schemas.microsoft.com/office/word/2018/wordml/cex" xmlns:w16cid="http://schemas.microsoft.com/office/word/2016/wordml/cid" xmlns:w16="http://schemas.microsoft.com/office/word/2018/wordml" xmlns:w16du="http://schemas.microsoft.com/office/word/2023/wordml/word16du" xmlns:w16sdtdh="http://schemas.microsoft.com/office/word/2020/wordml/sdtdatahash" xmlns:w16sdtfl="http://schemas.microsoft.com/office/word/2024/wordml/sdtformatlock" xmlns:w16se="http://schemas.microsoft.com/office/word/2015/wordml/symex" xmlns:wpg="http://schemas.microsoft.com/office/word/2010/wordprocessingGroup" xmlns:wpi="http://schemas.microsoft.com/office/word/2010/wordprocessingInk" xmlns:wne="http://schemas.microsoft.com/office/word/2006/wordml" xmlns:wps="http://schemas.microsoft.com/office/word/2010/wordprocessingShape" mc:Ignorable="w14 w15 w16se w16cid w16 w16cex w16sdtdh w16sdtfl w16du wp14">
+<w:hdr xmlns:wpc="http://schemas.microsoft.com/office/word/2010/wordprocessingCanvas" xmlns:cx="http://schemas.microsoft.com/office/drawing/2014/chartex" xmlns:cx1="http://schemas.microsoft.com/office/drawing/2015/9/8/chartex" xmlns:cx2="http://schemas.microsoft.com/office/drawing/2015/10/21/chartex" xmlns:cx3="http://schemas.microsoft.com/office/drawing/2016/5/9/chartex" xmlns:cx4="http://schemas.microsoft.com/office/drawing/2016/5/10/chartex" xmlns:cx5="http://schemas.microsoft.com/office/drawing/2016/5/11/chartex" xmlns:cx6="http://schemas.microsoft.com/office/drawing/2016/5/12/chartex" xmlns:cx7="http://schemas.microsoft.com/office/drawing/2016/5/13/chartex" xmlns:cx8="http://schemas.microsoft.com/office/drawing/2016/5/14/chartex" xmlns:mc="http://schemas.openxmlformats.org/markup-compatibility/2006" xmlns:aink="http://schemas.microsoft.com/office/drawing/2016/ink" xmlns:am3d="http://schemas.microsoft.com/office/drawing/2017/model3d" xmlns:o="urn:schemas-microsoft-com:office:office" xmlns:oel="http://schemas.microsoft.com/office/2019/extlst" xmlns:r="http://schemas.openxmlformats.org/officeDocument/2006/relationships" xmlns:m="http://schemas.openxmlformats.org/officeDocument/2006/math" xmlns:v="urn:schemas-microsoft-com:vml" xmlns:wp14="http://schemas.microsoft.com/office/word/2010/wordprocessingDrawing" xmlns:wp="http://schemas.openxmlformats.org/drawingml/2006/wordprocessingDrawing" xmlns:w10="urn:schemas-microsoft-com:office:word" xmlns:w="http://schemas.openxmlformats.org/wordprocessingml/2006/main" xmlns:w14="http://schemas.microsoft.com/office/word/2010/wordml" xmlns:w15="http://schemas.microsoft.com/office/word/2012/wordml" xmlns:w16cex="http://schemas.microsoft.com/office/word/2018/wordml/cex" xmlns:w16cid="http://schemas.microsoft.com/office/word/2016/wordml/cid" xmlns:w16="http://schemas.microsoft.com/office/word/2018/wordml" xmlns:w16du="http://schemas.microsoft.com/office/word/2023/wordml/word16du" xmlns:w16sdtdh="http://schemas.microsoft.com/office/word/2020/wordml/sdtdatahash" xmlns:w16sdtfl="http://schemas.microsoft.com/office/word/2024/wordml/sdtformatlock" xmlns:w16se="http://schemas.microsoft.com/office/word/2015/wordml/symex" xmlns:wpg="http://schemas.microsoft.com/office/word/2010/wordprocessingGroup" xmlns:wpi="http://schemas.microsoft.com/office/word/2010/wordprocessingInk" xmlns:wne="http://schemas.microsoft.com/office/word/2006/wordml" xmlns:wps="http://schemas.microsoft.com/office/word/2010/wordprocessingShape" mc:Ignorable="w14 w15 w16se w16cid w16 w16cex w16sdtdh w16sdtfl w16du wp14">
+  <w:p>
+    <w:pPr>
+      <w:pStyle w:val="a5"/>
+    </w:pPr>
+  </w:p>
+</w:hdr>
+</file>
+
+<file path=word/header2.xml><?xml version="1.0" encoding="utf-8"?>
+<w:hdr xmlns:wpc="http://schemas.microsoft.com/office/word/2010/wordprocessingCanvas" xmlns:cx="http://schemas.microsoft.com/office/drawing/2014/chartex" xmlns:cx1="http://schemas.microsoft.com/office/drawing/2015/9/8/chartex" xmlns:cx2="http://schemas.microsoft.com/office/drawing/2015/10/21/chartex" xmlns:cx3="http://schemas.microsoft.com/office/drawing/2016/5/9/chartex" xmlns:cx4="http://schemas.microsoft.com/office/drawing/2016/5/10/chartex" xmlns:cx5="http://schemas.microsoft.com/office/drawing/2016/5/11/chartex" xmlns:cx6="http://schemas.microsoft.com/office/drawing/2016/5/12/chartex" xmlns:cx7="http://schemas.microsoft.com/office/drawing/2016/5/13/chartex" xmlns:cx8="http://schemas.microsoft.com/office/drawing/2016/5/14/chartex" xmlns:mc="http://schemas.openxmlformats.org/markup-compatibility/2006" xmlns:aink="http://schemas.microsoft.com/office/drawing/2016/ink" xmlns:am3d="http://schemas.microsoft.com/office/drawing/2017/model3d" xmlns:o="urn:schemas-microsoft-com:office:office" xmlns:oel="http://schemas.microsoft.com/office/2019/extlst" xmlns:r="http://schemas.openxmlformats.org/officeDocument/2006/relationships" xmlns:m="http://schemas.openxmlformats.org/officeDocument/2006/math" xmlns:v="urn:schemas-microsoft-com:vml" xmlns:wp14="http://schemas.microsoft.com/office/word/2010/wordprocessingDrawing" xmlns:wp="http://schemas.openxmlformats.org/drawingml/2006/wordprocessingDrawing" xmlns:w10="urn:schemas-microsoft-com:office:word" xmlns:w="http://schemas.openxmlformats.org/wordprocessingml/2006/main" xmlns:w14="http://schemas.microsoft.com/office/word/2010/wordml" xmlns:w15="http://schemas.microsoft.com/office/word/2012/wordml" xmlns:w16cex="http://schemas.microsoft.com/office/word/2018/wordml/cex" xmlns:w16cid="http://schemas.microsoft.com/office/word/2016/wordml/cid" xmlns:w16="http://schemas.microsoft.com/office/word/2018/wordml" xmlns:w16du="http://schemas.microsoft.com/office/word/2023/wordml/word16du" xmlns:w16sdtdh="http://schemas.microsoft.com/office/word/2020/wordml/sdtdatahash" xmlns:w16sdtfl="http://schemas.microsoft.com/office/word/2024/wordml/sdtformatlock" xmlns:w16se="http://schemas.microsoft.com/office/word/2015/wordml/symex" xmlns:wpg="http://schemas.microsoft.com/office/word/2010/wordprocessingGroup" xmlns:wpi="http://schemas.microsoft.com/office/word/2010/wordprocessingInk" xmlns:wne="http://schemas.microsoft.com/office/word/2006/wordml" xmlns:wps="http://schemas.microsoft.com/office/word/2010/wordprocessingShape" mc:Ignorable="w14 w15 w16se w16cid w16 w16cex w16sdtdh w16sdtfl w16du wp14">
   <w:p>
     <w:pPr>
       <w:pStyle w:val="a5"/>
@@ -4415,86 +4442,24 @@
         <w:color w:val="666666"/>
         <w:sz w:val="16"/>
       </w:rPr>
-      <w:t xml:space="preserve">PMO </w:t>
-    </w:r>
-    <w:proofErr w:type="gramStart"/>
-    <w:r>
-      <w:rPr>
-        <w:rFonts w:eastAsia="Arial"/>
-        <w:color w:val="666666"/>
-        <w:sz w:val="16"/>
-      </w:rPr>
-      <w:t>Hub  |</w:t>
-    </w:r>
-    <w:proofErr w:type="gramEnd"/>
-    <w:r>
-      <w:rPr>
-        <w:rFonts w:eastAsia="Arial"/>
-        <w:color w:val="666666"/>
-        <w:sz w:val="16"/>
-      </w:rPr>
-      <w:t xml:space="preserve">  </w:t>
-    </w:r>
-    <w:proofErr w:type="spellStart"/>
-    <w:r>
-      <w:rPr>
-        <w:rFonts w:eastAsia="Arial"/>
-        <w:color w:val="666666"/>
-        <w:sz w:val="16"/>
-      </w:rPr>
-      <w:t>Паспорт</w:t>
-    </w:r>
-    <w:proofErr w:type="spellEnd"/>
-    <w:r>
-      <w:rPr>
-        <w:rFonts w:eastAsia="Arial"/>
-        <w:color w:val="666666"/>
-        <w:sz w:val="16"/>
-      </w:rPr>
-      <w:t xml:space="preserve"> і </w:t>
-    </w:r>
-    <w:proofErr w:type="spellStart"/>
-    <w:r>
-      <w:rPr>
-        <w:rFonts w:eastAsia="Arial"/>
-        <w:color w:val="666666"/>
-        <w:sz w:val="16"/>
-      </w:rPr>
-      <w:t>словник</w:t>
-    </w:r>
-    <w:proofErr w:type="spellEnd"/>
-    <w:r>
-      <w:rPr>
-        <w:rFonts w:eastAsia="Arial"/>
-        <w:color w:val="666666"/>
-        <w:sz w:val="16"/>
-      </w:rPr>
-      <w:t xml:space="preserve"> </w:t>
-    </w:r>
-    <w:proofErr w:type="spellStart"/>
-    <w:r>
-      <w:rPr>
-        <w:rFonts w:eastAsia="Arial"/>
-        <w:color w:val="666666"/>
-        <w:sz w:val="16"/>
-      </w:rPr>
-      <w:t>документації</w:t>
-    </w:r>
-    <w:proofErr w:type="spellEnd"/>
-    <w:r>
-      <w:rPr>
-        <w:rFonts w:eastAsia="Arial"/>
-        <w:color w:val="666666"/>
-        <w:sz w:val="16"/>
-      </w:rPr>
-      <w:t xml:space="preserve"> PMO Hub</w:t>
+      <w:t>PMO Hub  |  Паспорт і словник документації PMO Hub</w:t>
     </w:r>
   </w:p>
 </w:hdr>
 </file>
 
+<file path=word/header3.xml><?xml version="1.0" encoding="utf-8"?>
+<w:hdr xmlns:wpc="http://schemas.microsoft.com/office/word/2010/wordprocessingCanvas" xmlns:cx="http://schemas.microsoft.com/office/drawing/2014/chartex" xmlns:cx1="http://schemas.microsoft.com/office/drawing/2015/9/8/chartex" xmlns:cx2="http://schemas.microsoft.com/office/drawing/2015/10/21/chartex" xmlns:cx3="http://schemas.microsoft.com/office/drawing/2016/5/9/chartex" xmlns:cx4="http://schemas.microsoft.com/office/drawing/2016/5/10/chartex" xmlns:cx5="http://schemas.microsoft.com/office/drawing/2016/5/11/chartex" xmlns:cx6="http://schemas.microsoft.com/office/drawing/2016/5/12/chartex" xmlns:cx7="http://schemas.microsoft.com/office/drawing/2016/5/13/chartex" xmlns:cx8="http://schemas.microsoft.com/office/drawing/2016/5/14/chartex" xmlns:mc="http://schemas.openxmlformats.org/markup-compatibility/2006" xmlns:aink="http://schemas.microsoft.com/office/drawing/2016/ink" xmlns:am3d="http://schemas.microsoft.com/office/drawing/2017/model3d" xmlns:o="urn:schemas-microsoft-com:office:office" xmlns:oel="http://schemas.microsoft.com/office/2019/extlst" xmlns:r="http://schemas.openxmlformats.org/officeDocument/2006/relationships" xmlns:m="http://schemas.openxmlformats.org/officeDocument/2006/math" xmlns:v="urn:schemas-microsoft-com:vml" xmlns:wp14="http://schemas.microsoft.com/office/word/2010/wordprocessingDrawing" xmlns:wp="http://schemas.openxmlformats.org/drawingml/2006/wordprocessingDrawing" xmlns:w10="urn:schemas-microsoft-com:office:word" xmlns:w="http://schemas.openxmlformats.org/wordprocessingml/2006/main" xmlns:w14="http://schemas.microsoft.com/office/word/2010/wordml" xmlns:w15="http://schemas.microsoft.com/office/word/2012/wordml" xmlns:w16cex="http://schemas.microsoft.com/office/word/2018/wordml/cex" xmlns:w16cid="http://schemas.microsoft.com/office/word/2016/wordml/cid" xmlns:w16="http://schemas.microsoft.com/office/word/2018/wordml" xmlns:w16du="http://schemas.microsoft.com/office/word/2023/wordml/word16du" xmlns:w16sdtdh="http://schemas.microsoft.com/office/word/2020/wordml/sdtdatahash" xmlns:w16sdtfl="http://schemas.microsoft.com/office/word/2024/wordml/sdtformatlock" xmlns:w16se="http://schemas.microsoft.com/office/word/2015/wordml/symex" xmlns:wpg="http://schemas.microsoft.com/office/word/2010/wordprocessingGroup" xmlns:wpi="http://schemas.microsoft.com/office/word/2010/wordprocessingInk" xmlns:wne="http://schemas.microsoft.com/office/word/2006/wordml" xmlns:wps="http://schemas.microsoft.com/office/word/2010/wordprocessingShape" mc:Ignorable="w14 w15 w16se w16cid w16 w16cex w16sdtdh w16sdtfl w16du wp14">
+  <w:p>
+    <w:pPr>
+      <w:pStyle w:val="a5"/>
+    </w:pPr>
+  </w:p>
+</w:hdr>
+</file>
+
 <file path=word/numbering.xml><?xml version="1.0" encoding="utf-8"?>
-<w:numbering xmlns:wpc="http://schemas.microsoft.com/office/word/2010/wordprocessingCanvas" xmlns:cx="http://schemas.microsoft.com/office/drawing/2014/chartex" xmlns:cx1="http://schemas.microsoft.com/office/drawing/2015/9/8/chartex" xmlns:cx2="http://schemas.microsoft.com/office/drawing/2015/10/21/chartex" xmlns:cx3="http://schemas.microsoft.com/office/drawing/2016/5/9/chartex" xmlns:cx4="http://schemas.microsoft.com/office/drawing/2016/5/10/chartex" xmlns:cx5="http://schemas.microsoft.com/office/drawing/2016/5/11/chartex" xmlns:cx6="http://schemas.microsoft.com/office/drawing/2016/5/12/chartex" xmlns:cx7="http://schemas.microsoft.com/office/drawing/2016/5/13/chartex" xmlns:cx8="http://schemas.microsoft.com/office/drawing/2016/5/14/chartex" xmlns:mc="http://schemas.openxmlformats.org/markup-compatibility/2006" xmlns:aink="http://schemas.microsoft.com/office/drawing/2016/ink" xmlns:am3d="http://schemas.microsoft.com/office/drawing/2017/model3d" xmlns:o="urn:schemas-microsoft-com:office:office" xmlns:oel="http://schemas.microsoft.com/office/2019/extlst" xmlns:r="http://schemas.openxmlformats.org/officeDocument/2006/relationships" xmlns:m="http://schemas.openxmlformats.org/officeDocument/2006/math" xmlns:v="urn:schemas-microsoft-com:vml" xmlns:wp14="http://schemas.microsoft.com/office/word/2010/wordprocessingDrawing" xmlns:wp="http://schemas.openxmlformats.org/drawingml/2006/wordprocessingDrawing" xmlns:w10="urn:schemas-microsoft-com:office:word" xmlns:w="http://schemas.openxmlformats.org/wordprocessingml/2006/main" xmlns:w14="http://schemas.microsoft.com/office/word/2010/wordml" xmlns:w15="http://schemas.microsoft.com/office/word/2012/wordml" xmlns:w16cei="http://schemas.microsoft.com/office/word/2026/wordml/cei" xmlns:w16cex="http://schemas.microsoft.com/office/word/2018/wordml/cex" xmlns:w16cid="http://schemas.microsoft.com/office/word/2016/wordml/cid" xmlns:w16="http://schemas.microsoft.com/office/word/2018/wordml" xmlns:w16du="http://schemas.microsoft.com/office/word/2023/wordml/word16du" xmlns:w16sdtdh="http://schemas.microsoft.com/office/word/2020/wordml/sdtdatahash" xmlns:w16sdtfl="http://schemas.microsoft.com/office/word/2024/wordml/sdtformatlock" xmlns:w16se="http://schemas.microsoft.com/office/word/2015/wordml/symex" xmlns:wpg="http://schemas.microsoft.com/office/word/2010/wordprocessingGroup" xmlns:wpi="http://schemas.microsoft.com/office/word/2010/wordprocessingInk" xmlns:wne="http://schemas.microsoft.com/office/word/2006/wordml" xmlns:wps="http://schemas.microsoft.com/office/word/2010/wordprocessingShape" mc:Ignorable="w14 w15 w16se w16cid w16 w16cex w16sdtdh w16sdtfl w16du wp14">
+<w:numbering xmlns:wpc="http://schemas.microsoft.com/office/word/2010/wordprocessingCanvas" xmlns:cx="http://schemas.microsoft.com/office/drawing/2014/chartex" xmlns:cx1="http://schemas.microsoft.com/office/drawing/2015/9/8/chartex" xmlns:cx2="http://schemas.microsoft.com/office/drawing/2015/10/21/chartex" xmlns:cx3="http://schemas.microsoft.com/office/drawing/2016/5/9/chartex" xmlns:cx4="http://schemas.microsoft.com/office/drawing/2016/5/10/chartex" xmlns:cx5="http://schemas.microsoft.com/office/drawing/2016/5/11/chartex" xmlns:cx6="http://schemas.microsoft.com/office/drawing/2016/5/12/chartex" xmlns:cx7="http://schemas.microsoft.com/office/drawing/2016/5/13/chartex" xmlns:cx8="http://schemas.microsoft.com/office/drawing/2016/5/14/chartex" xmlns:mc="http://schemas.openxmlformats.org/markup-compatibility/2006" xmlns:aink="http://schemas.microsoft.com/office/drawing/2016/ink" xmlns:am3d="http://schemas.microsoft.com/office/drawing/2017/model3d" xmlns:o="urn:schemas-microsoft-com:office:office" xmlns:oel="http://schemas.microsoft.com/office/2019/extlst" xmlns:r="http://schemas.openxmlformats.org/officeDocument/2006/relationships" xmlns:m="http://schemas.openxmlformats.org/officeDocument/2006/math" xmlns:v="urn:schemas-microsoft-com:vml" xmlns:wp14="http://schemas.microsoft.com/office/word/2010/wordprocessingDrawing" xmlns:wp="http://schemas.openxmlformats.org/drawingml/2006/wordprocessingDrawing" xmlns:w10="urn:schemas-microsoft-com:office:word" xmlns:w="http://schemas.openxmlformats.org/wordprocessingml/2006/main" xmlns:w14="http://schemas.microsoft.com/office/word/2010/wordml" xmlns:w15="http://schemas.microsoft.com/office/word/2012/wordml" xmlns:w16cex="http://schemas.microsoft.com/office/word/2018/wordml/cex" xmlns:w16cid="http://schemas.microsoft.com/office/word/2016/wordml/cid" xmlns:w16="http://schemas.microsoft.com/office/word/2018/wordml" xmlns:w16du="http://schemas.microsoft.com/office/word/2023/wordml/word16du" xmlns:w16sdtdh="http://schemas.microsoft.com/office/word/2020/wordml/sdtdatahash" xmlns:w16sdtfl="http://schemas.microsoft.com/office/word/2024/wordml/sdtformatlock" xmlns:w16se="http://schemas.microsoft.com/office/word/2015/wordml/symex" xmlns:wpg="http://schemas.microsoft.com/office/word/2010/wordprocessingGroup" xmlns:wpi="http://schemas.microsoft.com/office/word/2010/wordprocessingInk" xmlns:wne="http://schemas.microsoft.com/office/word/2006/wordml" xmlns:wps="http://schemas.microsoft.com/office/word/2010/wordprocessingShape" mc:Ignorable="w14 w15 w16se w16cid w16 w16cex w16sdtdh w16sdtfl w16du wp14">
   <w:abstractNum w:abstractNumId="0" w15:restartNumberingAfterBreak="0">
     <w:nsid w:val="FFFFFF7C"/>
     <w:multiLevelType w:val="singleLevel"/>

</xml_diff>